<commit_message>
BF pre-sale handover: drop the buy-box prerequisite (already live)
Co-Authored-By: Claude Opus 5.5 <noreply@anthropic.com>
Claude-Session: https://claude.ai/code/session_01YUaqMprd9jDWbjH8Lh4n9H
</commit_message>
<xml_diff>
--- a/handoff/MUTO_Dev_Handoff_BF_Presale_18Oct2026.docx
+++ b/handoff/MUTO_Dev_Handoff_BF_Presale_18Oct2026.docx
@@ -97,43 +97,6 @@
       </w:pPr>
       <w:r>
         <w:t xml:space="preserve">Before you start</w:t>
-      </w:r>
-    </w:p>
-    <w:p>
-      <w:pPr>
-        <w:numPr>
-          <w:ilvl w:val="0"/>
-          <w:numId w:val="1001"/>
-        </w:numPr>
-        <w:pStyle w:val="Compact"/>
-      </w:pPr>
-      <w:r>
-        <w:rPr>
-          <w:bCs/>
-          <w:b/>
-        </w:rPr>
-        <w:t xml:space="preserve">Do this after the 17 October buy-box update.</w:t>
-      </w:r>
-      <w:r>
-        <w:t xml:space="preserve"> </w:t>
-      </w:r>
-      <w:r>
-        <w:t xml:space="preserve">The box sits above the new plan boxes and goes into the</w:t>
-      </w:r>
-      <w:r>
-        <w:t xml:space="preserve"> </w:t>
-      </w:r>
-      <w:r>
-        <w:rPr>
-          <w:rStyle w:val="VerbatimChar"/>
-        </w:rPr>
-        <w:t xml:space="preserve">easy_read</w:t>
-      </w:r>
-      <w:r>
-        <w:t xml:space="preserve"> </w:t>
-      </w:r>
-      <w:r>
-        <w:t xml:space="preserve">Custom Liquid block that update added.</w:t>
       </w:r>
     </w:p>
     <w:p>

</xml_diff>